<commit_message>
Fix stale homework downloads
</commit_message>
<xml_diff>
--- a/portal/public/downloads/EVERYONE-ELSE-AI-HUMAN-HOMEWORK-GUIDE.docx
+++ b/portal/public/downloads/EVERYONE-ELSE-AI-HUMAN-HOMEWORK-GUIDE.docx
@@ -255,7 +255,7 @@
           <w:color w:val="1F2937"/>
           <w:sz w:val="21"/>
         </w:rPr>
-        <w:t xml:space="preserve"> v1.5.1 company kit. The public kit is the clean setup and update source; it contains no live company work or secrets, so no GitHub invitation or collaborator seat is needed. Ask the Setup Helper to obtain and verify the kit. Then copy the Email and Drive starters into separate local work folders. Do not use the public distribution repository as a work project.</w:t>
+        <w:t xml:space="preserve"> v2.1.0 Kairali Employee Edition. The public kit is the clean setup and update source; it contains no live company work or secrets, so no GitHub invitation or collaborator seat is needed. Ask the Setup Helper to obtain and verify the kit. Then copy the Email and Drive starters into separate local work folders. Do not use the public distribution repository as a work project.</w:t>
       </w:r>
     </w:p>
     <w:p>
@@ -335,7 +335,7 @@
           <w:color w:val="1F2937"/>
           <w:sz w:val="21"/>
         </w:rPr>
-        <w:t xml:space="preserve"> - choose a 25-item test or index every connector-visible Drive item in checkpointed batches of 25. It does not open file contents or change Drive.</w:t>
+        <w:t xml:space="preserve"> - choose a 25-item test or index every connector-visible Drive item in checkpointed batches of 25. It creates a fast AI JSONL register and a matching human CSV or approved Google Sheet mirror without opening file contents or changing Drive. After full proof, you may choose a weekly refresh.</w:t>
       </w:r>
     </w:p>
     <w:p>
@@ -467,7 +467,7 @@
           <w:color w:val="1F2937"/>
           <w:sz w:val="21"/>
         </w:rPr>
-        <w:t xml:space="preserve">Full Drive Index is required and is live for you only after every supported scope, output file, final cursor and validator agree. </w:t>
+        <w:t xml:space="preserve">Full Drive Index is required and is live for you only after every supported scope, AI and human registers, relationship counts, receipt, final cursor and validators agree. </w:t>
       </w:r>
       <w:r>
         <w:rPr>
@@ -483,7 +483,7 @@
           <w:color w:val="1F2937"/>
           <w:sz w:val="21"/>
         </w:rPr>
-        <w:t xml:space="preserve"> proves setup only.</w:t>
+        <w:t xml:space="preserve"> proves setup only. Weekly refresh is optional and separate.</w:t>
       </w:r>
     </w:p>
     <w:p>
@@ -546,7 +546,7 @@
           <w:color w:val="1F2937"/>
           <w:sz w:val="21"/>
         </w:rPr>
-        <w:t>Ask the Setup Helper to find the verified public v1.5.1 company kit on your screen.</w:t>
+        <w:t>Ask the Setup Helper to find the verified public v2.1.0 Kairali Employee Edition on your screen.</w:t>
       </w:r>
     </w:p>
     <w:p>
@@ -1274,7 +1274,7 @@
           <w:color w:val="1F4D78"/>
           <w:sz w:val="19"/>
         </w:rPr>
-        <w:t>kairali-company-rollout-1.5.1.zip</w:t>
+        <w:t>KAIRALI-AI-HUMAN-v210-EMPLOYEE-EDITION-PUBLIC-KIT.zip</w:t>
       </w:r>
       <w:r>
         <w:rPr>
@@ -1807,7 +1807,7 @@
           <w:color w:val="1F2937"/>
           <w:sz w:val="21"/>
         </w:rPr>
-        <w:t>If the ZIP is not visible, do not search the whole computer. Paste the Setup Helper rescue. The helper checks Downloads, obtains the protected public v1.5.1 kit when safe, and asks Ambuj only if the approved source or access decision is missing.</w:t>
+        <w:t>If the ZIP is not visible, do not search the whole computer. Paste the Setup Helper rescue. The helper checks Downloads, obtains the protected public v2.1.0 kit when safe, and asks Ambuj only if the approved source or access decision is missing.</w:t>
       </w:r>
     </w:p>
     <w:p>
@@ -4807,7 +4807,7 @@
           <w:color w:val="1F4D78"/>
           <w:sz w:val="19"/>
         </w:rPr>
-        <w:t>DRIVE-INDEX.csv</w:t>
+        <w:t>DRIVE-INDEX.jsonl</w:t>
       </w:r>
       <w:r>
         <w:rPr>
@@ -4823,7 +4823,7 @@
           <w:color w:val="1F4D78"/>
           <w:sz w:val="19"/>
         </w:rPr>
-        <w:t>DRIVE-INDEX.md</w:t>
+        <w:t>DRIVE-REGISTER.csv</w:t>
       </w:r>
       <w:r>
         <w:rPr>
@@ -4831,7 +4831,7 @@
           <w:color w:val="1F2937"/>
           <w:sz w:val="21"/>
         </w:rPr>
-        <w:t xml:space="preserve"> and </w:t>
+        <w:t xml:space="preserve">, </w:t>
       </w:r>
       <w:r>
         <w:rPr>
@@ -4839,7 +4839,7 @@
           <w:color w:val="1F4D78"/>
           <w:sz w:val="19"/>
         </w:rPr>
-        <w:t>DRIVE-INDEX-CURSOR.md</w:t>
+        <w:t>DRIVE-INDEX.md</w:t>
       </w:r>
       <w:r>
         <w:rPr>
@@ -4847,7 +4847,39 @@
           <w:color w:val="1F2937"/>
           <w:sz w:val="21"/>
         </w:rPr>
-        <w:t xml:space="preserve"> exist.</w:t>
+        <w:t xml:space="preserve">, </w:t>
+      </w:r>
+      <w:r>
+        <w:rPr>
+          <w:rFonts w:ascii="Menlo" w:hAnsi="Menlo" w:eastAsia="Menlo" w:cs="Menlo"/>
+          <w:color w:val="1F4D78"/>
+          <w:sz w:val="19"/>
+        </w:rPr>
+        <w:t>DRIVE-INDEX-RECEIPT.json</w:t>
+      </w:r>
+      <w:r>
+        <w:rPr>
+          <w:rFonts w:ascii="Calibri" w:hAnsi="Calibri" w:eastAsia="Calibri" w:cs="Calibri"/>
+          <w:color w:val="1F2937"/>
+          <w:sz w:val="21"/>
+        </w:rPr>
+        <w:t xml:space="preserve"> and </w:t>
+      </w:r>
+      <w:r>
+        <w:rPr>
+          <w:rFonts w:ascii="Menlo" w:hAnsi="Menlo" w:eastAsia="Menlo" w:cs="Menlo"/>
+          <w:color w:val="1F4D78"/>
+          <w:sz w:val="19"/>
+        </w:rPr>
+        <w:t>DRIVE-INDEX-CURSOR.json</w:t>
+      </w:r>
+      <w:r>
+        <w:rPr>
+          <w:rFonts w:ascii="Calibri" w:hAnsi="Calibri" w:eastAsia="Calibri" w:cs="Calibri"/>
+          <w:color w:val="1F2937"/>
+          <w:sz w:val="21"/>
+        </w:rPr>
+        <w:t xml:space="preserve"> exist and reopen.</w:t>
       </w:r>
     </w:p>
     <w:p>
@@ -4864,7 +4896,7 @@
           <w:color w:val="1F2937"/>
           <w:sz w:val="21"/>
         </w:rPr>
-        <w:t>Every batch is no more than 25 items and has a durable checkpoint.</w:t>
+        <w:t>One generation ID and unique-item count match in every output. Unique owned/created, shared-with, shared-by, overlap and unknown counts recalculate correctly.</w:t>
       </w:r>
     </w:p>
     <w:p>
@@ -4877,35 +4909,11 @@
       </w:pPr>
       <w:r>
         <w:rPr>
-          <w:rFonts w:ascii="Menlo" w:hAnsi="Menlo" w:eastAsia="Menlo" w:cs="Menlo"/>
-          <w:color w:val="1F4D78"/>
-          <w:sz w:val="19"/>
-        </w:rPr>
-        <w:t>TEST 25</w:t>
-      </w:r>
-      <w:r>
-        <w:rPr>
           <w:rFonts w:ascii="Calibri" w:hAnsi="Calibri" w:eastAsia="Calibri" w:cs="Calibri"/>
           <w:color w:val="1F2937"/>
           <w:sz w:val="21"/>
         </w:rPr>
-        <w:t xml:space="preserve"> says the full Drive was not indexed. </w:t>
-      </w:r>
-      <w:r>
-        <w:rPr>
-          <w:rFonts w:ascii="Menlo" w:hAnsi="Menlo" w:eastAsia="Menlo" w:cs="Menlo"/>
-          <w:color w:val="1F4D78"/>
-          <w:sz w:val="19"/>
-        </w:rPr>
-        <w:t>FULL DRIVE INDEX</w:t>
-      </w:r>
-      <w:r>
-        <w:rPr>
-          <w:rFonts w:ascii="Calibri" w:hAnsi="Calibri" w:eastAsia="Calibri" w:cs="Calibri"/>
-          <w:color w:val="1F2937"/>
-          <w:sz w:val="21"/>
-        </w:rPr>
-        <w:t xml:space="preserve"> shows each connector-visible source scope has no next page, or names the coverage gap.</w:t>
+        <w:t>If you approved a Google Sheet mirror, its URL, generation ID and data-row count were read back. If Sheets was not connected or you said No, the CSV is the human register.</w:t>
       </w:r>
     </w:p>
     <w:p>
@@ -4922,7 +4930,7 @@
           <w:color w:val="1F2937"/>
           <w:sz w:val="21"/>
         </w:rPr>
-        <w:t>Stable item IDs prevent duplicate rows and let a new session resume.</w:t>
+        <w:t>Every batch is no more than 25 items and has a durable checkpoint.</w:t>
       </w:r>
     </w:p>
     <w:p>
@@ -4935,11 +4943,35 @@
       </w:pPr>
       <w:r>
         <w:rPr>
+          <w:rFonts w:ascii="Menlo" w:hAnsi="Menlo" w:eastAsia="Menlo" w:cs="Menlo"/>
+          <w:color w:val="1F4D78"/>
+          <w:sz w:val="19"/>
+        </w:rPr>
+        <w:t>TEST 25</w:t>
+      </w:r>
+      <w:r>
+        <w:rPr>
           <w:rFonts w:ascii="Calibri" w:hAnsi="Calibri" w:eastAsia="Calibri" w:cs="Calibri"/>
           <w:color w:val="1F2937"/>
           <w:sz w:val="21"/>
         </w:rPr>
-        <w:t>Missing fields say UNKNOWN; sensitive titles say HUMAN REVIEW.</w:t>
+        <w:t xml:space="preserve"> says the full Drive was not indexed. </w:t>
+      </w:r>
+      <w:r>
+        <w:rPr>
+          <w:rFonts w:ascii="Menlo" w:hAnsi="Menlo" w:eastAsia="Menlo" w:cs="Menlo"/>
+          <w:color w:val="1F4D78"/>
+          <w:sz w:val="19"/>
+        </w:rPr>
+        <w:t>FULL DRIVE INDEX</w:t>
+      </w:r>
+      <w:r>
+        <w:rPr>
+          <w:rFonts w:ascii="Calibri" w:hAnsi="Calibri" w:eastAsia="Calibri" w:cs="Calibri"/>
+          <w:color w:val="1F2937"/>
+          <w:sz w:val="21"/>
+        </w:rPr>
+        <w:t xml:space="preserve"> shows each connector-visible source scope has no next page, or names the coverage gap.</w:t>
       </w:r>
     </w:p>
     <w:p>
@@ -4956,7 +4988,7 @@
           <w:color w:val="1F2937"/>
           <w:sz w:val="21"/>
         </w:rPr>
-        <w:t>It says no Drive file content was opened or downloaded and no Drive item was created, edited, renamed, moved, shared, unshared, deleted or organized.</w:t>
+        <w:t>Stable item IDs prevent duplicate rows and let a new session resume.</w:t>
       </w:r>
     </w:p>
     <w:p>
@@ -4973,7 +5005,49 @@
           <w:color w:val="1F2937"/>
           <w:sz w:val="21"/>
         </w:rPr>
-        <w:t>The workspace validator passed.</w:t>
+        <w:t>Missing fields say UNKNOWN; sensitive titles say HUMAN REVIEW.</w:t>
+      </w:r>
+    </w:p>
+    <w:p>
+      <w:pPr>
+        <w:numPr>
+          <w:ilvl w:val="0"/>
+          <w:numId w:val="107"/>
+        </w:numPr>
+        <w:spacing w:before="0" w:after="80" w:line="288" w:lineRule="auto"/>
+      </w:pPr>
+      <w:r>
+        <w:rPr>
+          <w:rFonts w:ascii="Calibri" w:hAnsi="Calibri" w:eastAsia="Calibri" w:cs="Calibri"/>
+          <w:color w:val="1F2937"/>
+          <w:sz w:val="21"/>
+        </w:rPr>
+        <w:t>It says no Drive file content was opened or downloaded and no Drive item was created, edited, renamed, moved, shared, unshared, deleted or organized.</w:t>
+      </w:r>
+    </w:p>
+    <w:p>
+      <w:pPr>
+        <w:numPr>
+          <w:ilvl w:val="0"/>
+          <w:numId w:val="107"/>
+        </w:numPr>
+        <w:spacing w:before="0" w:after="80" w:line="288" w:lineRule="auto"/>
+      </w:pPr>
+      <w:r>
+        <w:rPr>
+          <w:rFonts w:ascii="Menlo" w:hAnsi="Menlo" w:eastAsia="Menlo" w:cs="Menlo"/>
+          <w:color w:val="1F4D78"/>
+          <w:sz w:val="19"/>
+        </w:rPr>
+        <w:t>validate_drive_register.py</w:t>
+      </w:r>
+      <w:r>
+        <w:rPr>
+          <w:rFonts w:ascii="Calibri" w:hAnsi="Calibri" w:eastAsia="Calibri" w:cs="Calibri"/>
+          <w:color w:val="1F2937"/>
+          <w:sz w:val="21"/>
+        </w:rPr>
+        <w:t xml:space="preserve"> and the workspace validator passed.</w:t>
       </w:r>
     </w:p>
     <w:p>
@@ -4997,7 +5071,7 @@
           <w:color w:val="0B2545"/>
           <w:sz w:val="21"/>
         </w:rPr>
-        <w:t xml:space="preserve"> You can show the index summary and cursor on your screen. A connected Drive account alone is not completion. The index helps Codex find files later, but opening a file later still needs current Drive permission and a new approved task.</w:t>
+        <w:t xml:space="preserve"> You can show the human register, AI register, summary, receipt and cursor on your screen. A connected Drive account alone is not completion. The JSONL helps Codex or Claude find metadata later only when this worker is named as an approved source; it is not permission for personal profiling. Opening a file later still needs current Drive permission and a new approved task.</w:t>
       </w:r>
     </w:p>
     <w:p>
@@ -5060,6 +5134,72 @@
           <w:sz w:val="21"/>
         </w:rPr>
         <w:t xml:space="preserve"> finishes every supported scope and the final validator passes.</w:t>
+      </w:r>
+    </w:p>
+    <w:p>
+      <w:pPr>
+        <w:pStyle w:val="Heading2"/>
+      </w:pPr>
+      <w:r>
+        <w:rPr>
+          <w:rFonts w:ascii="Calibri" w:hAnsi="Calibri" w:eastAsia="Calibri" w:cs="Calibri"/>
+          <w:color w:val="2E74B5"/>
+          <w:sz w:val="26"/>
+        </w:rPr>
+        <w:t>Optional weekly Drive refresh</w:t>
+      </w:r>
+    </w:p>
+    <w:p>
+      <w:pPr>
+        <w:spacing w:before="0" w:after="120" w:line="288" w:lineRule="auto"/>
+      </w:pPr>
+      <w:r>
+        <w:rPr>
+          <w:rFonts w:ascii="Calibri" w:hAnsi="Calibri" w:eastAsia="Calibri" w:cs="Calibri"/>
+          <w:color w:val="1F2937"/>
+          <w:sz w:val="21"/>
+        </w:rPr>
+        <w:t xml:space="preserve">After full mode passes, Codex asks whether you want a weekly refresh. Say No to leave it off. If Yes, choose the day and local-time window—Sunday night is suggested, or pick another convenient time—then confirm the time zone. Review the exact approved Drive account, project folder, schedule and metadata-only prompt. Say </w:t>
+      </w:r>
+      <w:r>
+        <w:rPr>
+          <w:rFonts w:ascii="Menlo" w:hAnsi="Menlo" w:eastAsia="Menlo" w:cs="Menlo"/>
+          <w:color w:val="1F4D78"/>
+          <w:sz w:val="19"/>
+        </w:rPr>
+        <w:t>ACTIVATE WEEKLY REFRESH</w:t>
+      </w:r>
+      <w:r>
+        <w:rPr>
+          <w:rFonts w:ascii="Calibri" w:hAnsi="Calibri" w:eastAsia="Calibri" w:cs="Calibri"/>
+          <w:color w:val="1F2937"/>
+          <w:sz w:val="21"/>
+        </w:rPr>
+        <w:t xml:space="preserve"> only when all are correct.</w:t>
+      </w:r>
+    </w:p>
+    <w:p>
+      <w:pPr>
+        <w:spacing w:before="60" w:after="180" w:line="288" w:lineRule="auto"/>
+        <w:ind w:left="173"/>
+        <w:shd w:fill="FFF8E8"/>
+      </w:pPr>
+      <w:r>
+        <w:rPr>
+          <w:rFonts w:ascii="Calibri" w:hAnsi="Calibri" w:eastAsia="Calibri" w:cs="Calibri"/>
+          <w:b/>
+          <w:color w:val="0B2545"/>
+          <w:sz w:val="21"/>
+        </w:rPr>
+        <w:t>DONE WHEN:</w:t>
+      </w:r>
+      <w:r>
+        <w:rPr>
+          <w:rFonts w:ascii="Calibri" w:hAnsi="Calibri" w:eastAsia="Calibri" w:cs="Calibri"/>
+          <w:color w:val="0B2545"/>
+          <w:sz w:val="21"/>
+        </w:rPr>
+        <w:t xml:space="preserve"> ChatGPT desktop Scheduled shows the exact card and next run, and one bounded pilot refresh adds or updates by stable item ID and passes both validators. The computer must be on, ChatGPT desktop running and this project available. A missed or approval-blocked run does not pretend to have updated the register. You can pause, edit or delete the scheduled task without deleting the registers.</w:t>
       </w:r>
     </w:p>
     <w:p>
@@ -5932,7 +6072,7 @@
           <w:color w:val="1F2937"/>
           <w:sz w:val="21"/>
         </w:rPr>
-        <w:t xml:space="preserve">Drive project open with </w:t>
+        <w:t xml:space="preserve">Drive project open with its human register, </w:t>
       </w:r>
       <w:r>
         <w:rPr>
@@ -5948,7 +6088,7 @@
           <w:color w:val="1F2937"/>
           <w:sz w:val="21"/>
         </w:rPr>
-        <w:t xml:space="preserve"> and its saved cursor.</w:t>
+        <w:t>, receipt and saved cursor; optional weekly card only if the employee activated it.</w:t>
       </w:r>
     </w:p>
     <w:p>
@@ -6487,7 +6627,7 @@
           <w:color w:val="1F2937"/>
           <w:sz w:val="21"/>
         </w:rPr>
-        <w:t>ChatGPT quickstart: https://learn.chatgpt.com/docs/quickstart</w:t>
+        <w:t>Setup, desktop and projects: https://learn.chatgpt.com/docs/quickstart · https://learn.chatgpt.com/docs/app · https://learn.chatgpt.com/docs/projects</w:t>
       </w:r>
     </w:p>
     <w:p>
@@ -6504,75 +6644,7 @@
           <w:color w:val="1F2937"/>
           <w:sz w:val="21"/>
         </w:rPr>
-        <w:t>ChatGPT desktop app: https://learn.chatgpt.com/docs/app</w:t>
-      </w:r>
-    </w:p>
-    <w:p>
-      <w:pPr>
-        <w:numPr>
-          <w:ilvl w:val="0"/>
-          <w:numId w:val="131"/>
-        </w:numPr>
-        <w:spacing w:before="0" w:after="80" w:line="288" w:lineRule="auto"/>
-      </w:pPr>
-      <w:r>
-        <w:rPr>
-          <w:rFonts w:ascii="Calibri" w:hAnsi="Calibri" w:eastAsia="Calibri" w:cs="Calibri"/>
-          <w:color w:val="1F2937"/>
-          <w:sz w:val="21"/>
-        </w:rPr>
-        <w:t>Projects and chats: https://learn.chatgpt.com/docs/projects</w:t>
-      </w:r>
-    </w:p>
-    <w:p>
-      <w:pPr>
-        <w:numPr>
-          <w:ilvl w:val="0"/>
-          <w:numId w:val="131"/>
-        </w:numPr>
-        <w:spacing w:before="0" w:after="80" w:line="288" w:lineRule="auto"/>
-      </w:pPr>
-      <w:r>
-        <w:rPr>
-          <w:rFonts w:ascii="Calibri" w:hAnsi="Calibri" w:eastAsia="Calibri" w:cs="Calibri"/>
-          <w:color w:val="1F2937"/>
-          <w:sz w:val="21"/>
-        </w:rPr>
-        <w:t>Apps: https://help.openai.com/en/articles/11487775-connectors-in-chatgpt</w:t>
-      </w:r>
-    </w:p>
-    <w:p>
-      <w:pPr>
-        <w:numPr>
-          <w:ilvl w:val="0"/>
-          <w:numId w:val="131"/>
-        </w:numPr>
-        <w:spacing w:before="0" w:after="80" w:line="288" w:lineRule="auto"/>
-      </w:pPr>
-      <w:r>
-        <w:rPr>
-          <w:rFonts w:ascii="Calibri" w:hAnsi="Calibri" w:eastAsia="Calibri" w:cs="Calibri"/>
-          <w:color w:val="1F2937"/>
-          <w:sz w:val="21"/>
-        </w:rPr>
-        <w:t>Email inbox use case: https://learn.chatgpt.com/use-cases/manage-your-inbox</w:t>
-      </w:r>
-    </w:p>
-    <w:p>
-      <w:pPr>
-        <w:numPr>
-          <w:ilvl w:val="0"/>
-          <w:numId w:val="131"/>
-        </w:numPr>
-        <w:spacing w:before="0" w:after="80" w:line="288" w:lineRule="auto"/>
-      </w:pPr>
-      <w:r>
-        <w:rPr>
-          <w:rFonts w:ascii="Calibri" w:hAnsi="Calibri" w:eastAsia="Calibri" w:cs="Calibri"/>
-          <w:color w:val="1F2937"/>
-          <w:sz w:val="21"/>
-        </w:rPr>
-        <w:t>Computer Use with Codex: https://learn.chatgpt.com/use-cases/use-your-computer-with-codex</w:t>
+        <w:t>Apps and scheduled tasks: https://help.openai.com/en/articles/11487775-connectors-in-chatgpt · https://learn.chatgpt.com/docs/automations?surface=app</w:t>
       </w:r>
     </w:p>
     <w:sectPr>

</xml_diff>